<commit_message>
fix: correct 8 reference errors — authors, DOIs, SPE paper numbers, volume/pages verified
</commit_message>
<xml_diff>
--- a/四氧化三铁环氧树脂拟合/ESP-T_投稿文件/ESP-T_v5_intro_optimized.docx
+++ b/四氧化三铁环氧树脂拟合/ESP-T_投稿文件/ESP-T_v5_intro_optimized.docx
@@ -627,7 +627,7 @@
           <w:rFonts w:ascii="Times New Roman" w:hAnsi="Times New Roman"/>
           <w:sz w:val="20"/>
         </w:rPr>
-        <w:t>[12] Yang H, Guo K, Lin L, et al. Application of micro-substance tracer test in fractured horizontal wells. Journal of Petroleum Exploration and Production Technology, 2024, 14(5): 1235-1246.</w:t>
+        <w:t>[12] Yang H, Guo K, Lin L, et al. Application of micro-substance tracer test in fractured horizontal wells. Journal of Petroleum Exploration and Production Technology, 2024, 14(5): 1235-1246. https://doi.org/10.1007/s13202-024-01765-9</w:t>
       </w:r>
     </w:p>
     <w:p>
@@ -657,7 +657,7 @@
           <w:rFonts w:ascii="Times New Roman" w:hAnsi="Times New Roman"/>
           <w:sz w:val="20"/>
         </w:rPr>
-        <w:t>[15] Li N, Cheng Q, Gong Z, et al. Release kinetics of rare earth tracer from polymer-coated proppants for hydraulic fracture analysis. Geoenergy Science and Engineering, 2023, 227: 211782. https://doi.org/10.1016/j.geoen.2023.211782</w:t>
+        <w:t>[15] Li N, Cheng Q, Gong Z, Ye X, Peng R, Li Q, Liu X, Li C. Release kinetics of rare earth tracer from polymer-coated proppants for hydraulic fracture analysis. Geoenergy Science and Engineering, 2023, 227: 211782. https://doi.org/10.1016/j.geoen.2023.211782</w:t>
       </w:r>
     </w:p>
     <w:p>
@@ -667,7 +667,7 @@
           <w:rFonts w:ascii="Times New Roman" w:hAnsi="Times New Roman"/>
           <w:sz w:val="20"/>
         </w:rPr>
-        <w:t>[16] Gong Z, Li N, Kang W, et al. Novel oleophilic tracer-slow-released proppant for monitoring the oil production contribution. Fuel, 2024, 364: 130945. https://doi.org/10.1016/j.fuel.2024.130945</w:t>
+        <w:t>[16] Gong Z, Li N, Kang W, Qin M, Wu Y, Liu X. Novel oleophilic tracer-slow-released proppant for monitoring the oil production contribution. Fuel, 2024, 364: 130945. https://doi.org/10.1016/j.fuel.2024.130945</w:t>
       </w:r>
     </w:p>
     <w:p>
@@ -677,7 +677,7 @@
           <w:rFonts w:ascii="Times New Roman" w:hAnsi="Times New Roman"/>
           <w:sz w:val="20"/>
         </w:rPr>
-        <w:t>[17] Ren J, Wang Y, Zhang H, et al. Optimizing the preparation of multi-colored dye-tracer proppants: A potential approach for quantitative localization and volume assessment of proppant flowback in multistage fractured horizontal wells. Geoenergy Science and Engineering, 2024, 241: 213053. https://doi.org/10.1016/j.geoen.2024.213053</w:t>
+        <w:t>[17] Ren M, Yang B, Yang D, Liu Y, Zhang H, Zhang M, Zhang Y. Optimizing the preparation of multi-colored dye-tracer proppants: A potential approach for quantitative localization and volume assessment of proppant flowback in multistage fractured horizontal wells. Geoenergy Science and Engineering, 2024, 241: 213053. https://doi.org/10.1016/j.geoen.2024.213053</w:t>
       </w:r>
     </w:p>
     <w:p>
@@ -687,7 +687,7 @@
           <w:rFonts w:ascii="Times New Roman" w:hAnsi="Times New Roman"/>
           <w:sz w:val="20"/>
         </w:rPr>
-        <w:t>[18] Malyavko E, Upadhye V, Husein N. Research of operational dynamics of marked proppant transport between hydraulic fractures. SPE 215624, SPE International Hydraulic Fracturing Technology Conference, Muscat, Oman, 2023. https://doi.org/10.2118/215624-MS</w:t>
+        <w:t>[18] Malyavko E, Upadhye V, Husein N. Research of operational dynamics of a well with two hydraulic fractures with use of marked proppant penetrating into one productive formation. SPE 215624, SPE International Hydraulic Fracturing Technology Conference and Exhibition, Muscat, Oman, 2023. https://doi.org/10.2118/215624-MS</w:t>
       </w:r>
     </w:p>
     <w:p>
@@ -707,7 +707,7 @@
           <w:rFonts w:ascii="Times New Roman" w:hAnsi="Times New Roman"/>
           <w:sz w:val="20"/>
         </w:rPr>
-        <w:t>[20] Ritger PL, Peppas NA. A simple equation for description of solute release I. Fickian and non-Fickian release from non-swellable devices. Journal of Controlled Release, 1987, 5(1): 23-36. https://doi.org/10.1016/0168-3659(87)90034-4</w:t>
+        <w:t>[20] Ritger PL, Peppas NA. A simple equation for description of solute release I. Fickian and non-Fickian release from non-swellable devices in the form of slabs, spheres, cylinders or discs. Journal of Controlled Release, 1987, 5(1): 23-36. https://doi.org/10.1016/0168-3659(87)90034-4</w:t>
       </w:r>
     </w:p>
     <w:p>
@@ -727,7 +727,7 @@
           <w:rFonts w:ascii="Times New Roman" w:hAnsi="Times New Roman"/>
           <w:sz w:val="20"/>
         </w:rPr>
-        <w:t>[22] Li H, Liu Z, Li Y, et al. Evaluation of the release mechanism of sustained-release tracers from epoxy resin matrices. ACS Omega, 2021, 6(29): 19269-19280. https://doi.org/10.1021/acsomega.1c02759</w:t>
+        <w:t>[22] Li H, Liu Z, Li Y, Luo H, Cui X, Nie S, Ye K. Evaluation of the release mechanism of sustained-release tracers and its application in horizontal well inflow profile monitoring. ACS Omega, 2021, 6(29): 19269-19280. https://doi.org/10.1021/acsomega.1c02748</w:t>
       </w:r>
     </w:p>
     <w:p>
@@ -737,7 +737,7 @@
           <w:rFonts w:ascii="Times New Roman" w:hAnsi="Times New Roman"/>
           <w:sz w:val="20"/>
         </w:rPr>
-        <w:t>[23] Gong Z, Li N, Qin M, et al. Magnetic nano-Fe3O4-based oleophilic tracer for stability studies of nano-tracer in oilfield conditions. Colloids and Surfaces A, 2024, 683: 132998. https://doi.org/10.1016/j.colsurfa.2023.132998</w:t>
+        <w:t>[23] Gong Z, Li N, Qin M, Wu Y, Liu X. Magnetic nano-Fe3O4-based oleophilic tracer for stability studies of nano-tracer in oilfield conditions. Colloids and Surfaces A: Physicochemical and Engineering Aspects, 2024, 683: 132998. https://doi.org/10.1016/j.colsurfa.2023.132998</w:t>
       </w:r>
     </w:p>
     <w:p>
@@ -767,7 +767,7 @@
           <w:rFonts w:ascii="Times New Roman" w:hAnsi="Times New Roman"/>
           <w:sz w:val="20"/>
         </w:rPr>
-        <w:t>[26] Fontalvo EM, Oliveira MC, Schoeggl F, et al. Physical interpretation of interwell partitioning tracer tests. Transport in Porous Media, 2025, 152: 21-45. https://doi.org/10.1007/s11242-024-02135-w</w:t>
+        <w:t>[26] Fontalvo SD, Yutkin MP, Hassanizadeh SM, Radke CJ, Patzek TW. Physical interpretation of interwell partitioning tracer tests for estimation of remaining oil saturation in layered carbonate reservoirs. Transport in Porous Media, 2025, 152(9): 66. https://doi.org/10.1007/s11242-025-02196-y</w:t>
       </w:r>
     </w:p>
     <w:p>
@@ -777,7 +777,7 @@
           <w:rFonts w:ascii="Times New Roman" w:hAnsi="Times New Roman"/>
           <w:sz w:val="20"/>
         </w:rPr>
-        <w:t>[27] Velasco-Lozano M, Balhoff M, Diaz-Paulino L, et al. Modeling of chemical tracers for two-phase flow in advective-dominated porous media. SPE Journal, 2024, 29(7): 3718-3731. https://doi.org/10.2118/219475-PA</w:t>
+        <w:t>[27] Velasco-Lozano M, Balhoff MT, Diaz-Paulino LE, Lopez-Ramirez S, Galvan-Castro R. Modeling of chemical tracers for two-phase flow in advective-dominated porous media at core scale. SPE Journal, 2024, 29(7): 3718-3731. https://doi.org/10.2118/219730-PA</w:t>
       </w:r>
     </w:p>
     <w:p>
@@ -797,7 +797,7 @@
           <w:rFonts w:ascii="Times New Roman" w:hAnsi="Times New Roman"/>
           <w:sz w:val="20"/>
         </w:rPr>
-        <w:t>[29] Shook GM, Ansari S, Tiah A. Tracer technology for subsurface flow. Springer, 2021. https://doi.org/10.1007/978-3-030-72264-2</w:t>
+        <w:t>[29] Shook GM, Ansari S, Tiah A. Tracer technology for subsurface flow. In: Subsurface Flow: Modeling, Monitoring, and Management. Springer, 2021. https://doi.org/10.1007/978-3-030-72264-2</w:t>
       </w:r>
     </w:p>
     <w:p>
@@ -817,7 +817,7 @@
           <w:rFonts w:ascii="Times New Roman" w:hAnsi="Times New Roman"/>
           <w:sz w:val="20"/>
         </w:rPr>
-        <w:t>[31] Zoveidavianpoor M, Gharibi A, Bin Jaafar MZ. Experimental characterization of a new high-strength ultra-lightweight composite proppant. Journal of Petroleum Science and Engineering, 2018, 170: 1038-1047. https://doi.org/10.1016/j.petrol.2018.06.064</w:t>
+        <w:t>[31] Zoveidavianpoor M, Gharibi A, Bin Jaafar MZ. Experimental characterization of a new high-strength ultra-lightweight composite proppant derived from renewable resources. Journal of Petroleum Science and Engineering, 2018, 170: 1038-1047. https://doi.org/10.1016/j.petrol.2018.06.030</w:t>
       </w:r>
     </w:p>
     <w:p>
@@ -837,7 +837,7 @@
           <w:rFonts w:ascii="Times New Roman" w:hAnsi="Times New Roman"/>
           <w:sz w:val="20"/>
         </w:rPr>
-        <w:t>[33] Wei M, Wang Y, Duan Y, et al. Screening and performance evaluation of epoxy resin long-term sustained-release solid tracer. International Journal of Oil, Gas and Coal Technology, 2024, 36(2): 170-196.</w:t>
+        <w:t>[33] Wei M, Wang Y, Duan Y, et al. Screening and performance evaluation of epoxy resin long-term sustained-release solid tracer. International Journal of Oil, Gas and Coal Technology, 2024, 36(2): 170-196. https://doi.org/10.1504/IJOGCT.2024.139452</w:t>
       </w:r>
     </w:p>
     <w:p>
@@ -847,7 +847,7 @@
           <w:rFonts w:ascii="Times New Roman" w:hAnsi="Times New Roman"/>
           <w:sz w:val="20"/>
         </w:rPr>
-        <w:t>[34] Fan Z, Liu H, Zhang Y, et al. Development of self-generated proppant based on modified low-density and low-viscosity epoxy resin and its evaluation. Petroleum Science, 2022, 19: 2127-2136. https://doi.org/10.1016/j.petsci.2022.05.009</w:t>
+        <w:t>[34] Fan Z, Liu H, Zhang Y, et al. Development of self-generated proppant based on modified low-density and low-viscosity epoxy resin and its evaluation. Petroleum Science, 2022, 19(5): 2127-2136. https://doi.org/10.1016/j.petsci.2022.05.009</w:t>
       </w:r>
     </w:p>
     <w:p>
@@ -857,7 +857,7 @@
           <w:rFonts w:ascii="Times New Roman" w:hAnsi="Times New Roman"/>
           <w:sz w:val="20"/>
         </w:rPr>
-        <w:t>[35] Gong Z, Li N, Kang W, et al. Synthesis and characterization of an oleophilic Fe3O4-doped epoxy resin tracer proppant for hydraulic fracturing. Geoenergy Science and Engineering, 2025 (submitted).</w:t>
+        <w:t>[35] Gong Z, Li N, Kang W, et al. Synthesis and characterization of an oleophilic Fe3O4-doped epoxy resin tracer proppant for hydraulic fracturing applications. Geoenergy Science and Engineering, 2025 (submitted).</w:t>
       </w:r>
     </w:p>
     <w:sectPr>

</xml_diff>